<commit_message>
docs: finalize M1 workflow and regenerate delivery materials
</commit_message>
<xml_diff>
--- a/deliverables/m1/PROJECT-MILESTONE1-3-在阴雨天游泳-报告.docx
+++ b/deliverables/m1/PROJECT-MILESTONE1-3-在阴雨天游泳-报告.docx
@@ -52,7 +52,7 @@
           <w:color w:val="000000"/>
           <w:sz w:val="20"/>
         </w:rPr>
-        <w:t>本文件规定团队职责、沟通、任务管理、版本控制及 M1–M5 行动计划。</w:t>
+        <w:t>本文件明确团队目标与职责、约定沟通、任务管理与版本控制方案，明细 M1–M5 行动计划。</w:t>
       </w:r>
     </w:p>
     <w:p>
@@ -79,7 +79,7 @@
           <w:color w:val="000000"/>
           <w:sz w:val="20"/>
         </w:rPr>
-        <w:t>团队开发基于 LoCoMo 的 Web 应用，完成记忆构建、检索、状态判断、证据展示和 JSON 导出，以回答 F1、Recall@K、状态准确率和对照实验评价。M1 确定协作流程与行动计划，技术细节留待需求和设计阶段。</w:t>
+        <w:t>团队目标为开发基于 LoCoMo 的 Web 应用，此应用支持长期对话记忆构建与可视化，并完善动态记忆更新与有效记忆检索。此 Web 应用以回答 F1、Recall@K、状态准确率和对照实验作为测评指标。</w:t>
       </w:r>
     </w:p>
     <w:p>
@@ -92,7 +92,7 @@
           <w:color w:val="000000"/>
           <w:sz w:val="18"/>
         </w:rPr>
-        <w:t>表 1 模块职责与交付边界</w:t>
+        <w:t>表 1 团队成员职责与应交付产物</w:t>
       </w:r>
     </w:p>
     <w:tbl>
@@ -567,568 +567,7 @@
           <w:color w:val="000000"/>
           <w:sz w:val="20"/>
         </w:rPr>
-        <w:t>投入包含开发、文档、会议、复核和返工；重叠里程碑共享该预算。各人负责自己模块的实现、测试、文档和汇报素材。集成缺陷按来源交回对应模块，不集中由组长补修；分配调整由组长结合依赖和实际投入决定。</w:t>
-      </w:r>
-    </w:p>
-    <w:p>
-      <w:pPr>
-        <w:pStyle w:val="Caption"/>
-      </w:pPr>
-      <w:r>
-        <w:rPr>
-          <w:rFonts w:ascii="Noto Sans CJK SC" w:hAnsi="Noto Sans CJK SC" w:eastAsia="Noto Sans CJK SC" w:cs="Noto Sans CJK SC"/>
-          <w:color w:val="000000"/>
-          <w:sz w:val="18"/>
-        </w:rPr>
-        <w:t>表 2 近期材料与管理职责</w:t>
-      </w:r>
-    </w:p>
-    <w:tbl>
-      <w:tblPr>
-        <w:tblW w:type="auto" w:w="0"/>
-        <w:jc w:val="center"/>
-        <w:tblLayout w:type="fixed"/>
-        <w:tblLook w:firstColumn="1" w:firstRow="1" w:lastColumn="0" w:lastRow="0" w:noHBand="0" w:noVBand="1" w:val="04A0"/>
-        <w:tblBorders>
-          <w:top w:val="single" w:sz="4" w:color="D9D9D9"/>
-          <w:left w:val="single" w:sz="4" w:color="D9D9D9"/>
-          <w:bottom w:val="single" w:sz="4" w:color="D9D9D9"/>
-          <w:right w:val="single" w:sz="4" w:color="D9D9D9"/>
-          <w:insideH w:val="single" w:sz="4" w:color="D9D9D9"/>
-          <w:insideV w:val="single" w:sz="4" w:color="D9D9D9"/>
-        </w:tblBorders>
-      </w:tblPr>
-      <w:tblGrid>
-        <w:gridCol w:w="4195"/>
-        <w:gridCol w:w="2608"/>
-        <w:gridCol w:w="2608"/>
-      </w:tblGrid>
-      <w:tr>
-        <w:trPr>
-          <w:cantSplit/>
-          <w:tblHeader/>
-        </w:trPr>
-        <w:tc>
-          <w:tcPr>
-            <w:tcW w:type="dxa" w:w="4195"/>
-            <w:vAlign w:val="center"/>
-            <w:shd w:fill="E7EDF4"/>
-            <w:tcMar>
-              <w:top w:w="65" w:type="dxa"/>
-              <w:bottom w:w="65" w:type="dxa"/>
-              <w:left w:w="95" w:type="dxa"/>
-              <w:right w:w="95" w:type="dxa"/>
-            </w:tcMar>
-          </w:tcPr>
-          <w:p>
-            <w:pPr>
-              <w:spacing w:after="0" w:before="0" w:line="259" w:lineRule="auto"/>
-            </w:pPr>
-            <w:r>
-              <w:rPr>
-                <w:rFonts w:ascii="Noto Sans CJK SC" w:hAnsi="Noto Sans CJK SC" w:eastAsia="Noto Sans CJK SC" w:cs="Noto Sans CJK SC"/>
-                <w:b/>
-                <w:color w:val="000000"/>
-                <w:sz w:val="19"/>
-              </w:rPr>
-              <w:t>工作</w:t>
-            </w:r>
-          </w:p>
-        </w:tc>
-        <w:tc>
-          <w:tcPr>
-            <w:tcW w:type="dxa" w:w="2608"/>
-            <w:vAlign w:val="center"/>
-            <w:shd w:fill="E7EDF4"/>
-            <w:tcMar>
-              <w:top w:w="65" w:type="dxa"/>
-              <w:bottom w:w="65" w:type="dxa"/>
-              <w:left w:w="95" w:type="dxa"/>
-              <w:right w:w="95" w:type="dxa"/>
-            </w:tcMar>
-          </w:tcPr>
-          <w:p>
-            <w:pPr>
-              <w:spacing w:after="0" w:before="0" w:line="259" w:lineRule="auto"/>
-            </w:pPr>
-            <w:r>
-              <w:rPr>
-                <w:rFonts w:ascii="Noto Sans CJK SC" w:hAnsi="Noto Sans CJK SC" w:eastAsia="Noto Sans CJK SC" w:cs="Noto Sans CJK SC"/>
-                <w:b/>
-                <w:color w:val="000000"/>
-                <w:sz w:val="19"/>
-              </w:rPr>
-              <w:t>主责</w:t>
-            </w:r>
-          </w:p>
-        </w:tc>
-        <w:tc>
-          <w:tcPr>
-            <w:tcW w:type="dxa" w:w="2608"/>
-            <w:vAlign w:val="center"/>
-            <w:shd w:fill="E7EDF4"/>
-            <w:tcMar>
-              <w:top w:w="65" w:type="dxa"/>
-              <w:bottom w:w="65" w:type="dxa"/>
-              <w:left w:w="95" w:type="dxa"/>
-              <w:right w:w="95" w:type="dxa"/>
-            </w:tcMar>
-          </w:tcPr>
-          <w:p>
-            <w:pPr>
-              <w:spacing w:after="0" w:before="0" w:line="259" w:lineRule="auto"/>
-            </w:pPr>
-            <w:r>
-              <w:rPr>
-                <w:rFonts w:ascii="Noto Sans CJK SC" w:hAnsi="Noto Sans CJK SC" w:eastAsia="Noto Sans CJK SC" w:cs="Noto Sans CJK SC"/>
-                <w:b/>
-                <w:color w:val="000000"/>
-                <w:sz w:val="19"/>
-              </w:rPr>
-              <w:t>复核</w:t>
-            </w:r>
-          </w:p>
-        </w:tc>
-      </w:tr>
-      <w:tr>
-        <w:trPr>
-          <w:cantSplit/>
-        </w:trPr>
-        <w:tc>
-          <w:tcPr>
-            <w:tcW w:type="dxa" w:w="4195"/>
-            <w:vAlign w:val="center"/>
-            <w:shd w:fill="FFFFFF"/>
-            <w:tcMar>
-              <w:top w:w="65" w:type="dxa"/>
-              <w:bottom w:w="65" w:type="dxa"/>
-              <w:left w:w="95" w:type="dxa"/>
-              <w:right w:w="95" w:type="dxa"/>
-            </w:tcMar>
-          </w:tcPr>
-          <w:p>
-            <w:pPr>
-              <w:spacing w:after="0" w:before="0" w:line="259" w:lineRule="auto"/>
-            </w:pPr>
-            <w:r>
-              <w:rPr>
-                <w:rFonts w:ascii="Noto Sans CJK SC" w:hAnsi="Noto Sans CJK SC" w:eastAsia="Noto Sans CJK SC" w:cs="Noto Sans CJK SC"/>
-                <w:b w:val="0"/>
-                <w:color w:val="000000"/>
-                <w:sz w:val="19"/>
-              </w:rPr>
-              <w:t>M1 Team Workflow</w:t>
-            </w:r>
-          </w:p>
-        </w:tc>
-        <w:tc>
-          <w:tcPr>
-            <w:tcW w:type="dxa" w:w="2608"/>
-            <w:vAlign w:val="center"/>
-            <w:shd w:fill="FFFFFF"/>
-            <w:tcMar>
-              <w:top w:w="65" w:type="dxa"/>
-              <w:bottom w:w="65" w:type="dxa"/>
-              <w:left w:w="95" w:type="dxa"/>
-              <w:right w:w="95" w:type="dxa"/>
-            </w:tcMar>
-          </w:tcPr>
-          <w:p>
-            <w:pPr>
-              <w:spacing w:after="0" w:before="0" w:line="259" w:lineRule="auto"/>
-            </w:pPr>
-            <w:r>
-              <w:rPr>
-                <w:rFonts w:ascii="Noto Sans CJK SC" w:hAnsi="Noto Sans CJK SC" w:eastAsia="Noto Sans CJK SC" w:cs="Noto Sans CJK SC"/>
-                <w:b w:val="0"/>
-                <w:color w:val="000000"/>
-                <w:sz w:val="19"/>
-              </w:rPr>
-              <w:t>莫远序</w:t>
-            </w:r>
-          </w:p>
-        </w:tc>
-        <w:tc>
-          <w:tcPr>
-            <w:tcW w:type="dxa" w:w="2608"/>
-            <w:vAlign w:val="center"/>
-            <w:shd w:fill="FFFFFF"/>
-            <w:tcMar>
-              <w:top w:w="65" w:type="dxa"/>
-              <w:bottom w:w="65" w:type="dxa"/>
-              <w:left w:w="95" w:type="dxa"/>
-              <w:right w:w="95" w:type="dxa"/>
-            </w:tcMar>
-          </w:tcPr>
-          <w:p>
-            <w:pPr>
-              <w:spacing w:after="0" w:before="0" w:line="259" w:lineRule="auto"/>
-            </w:pPr>
-            <w:r>
-              <w:rPr>
-                <w:rFonts w:ascii="Noto Sans CJK SC" w:hAnsi="Noto Sans CJK SC" w:eastAsia="Noto Sans CJK SC" w:cs="Noto Sans CJK SC"/>
-                <w:b w:val="0"/>
-                <w:color w:val="000000"/>
-                <w:sz w:val="19"/>
-              </w:rPr>
-              <w:t>黎志丽</w:t>
-            </w:r>
-          </w:p>
-        </w:tc>
-      </w:tr>
-      <w:tr>
-        <w:trPr>
-          <w:cantSplit/>
-        </w:trPr>
-        <w:tc>
-          <w:tcPr>
-            <w:tcW w:type="dxa" w:w="4195"/>
-            <w:vAlign w:val="center"/>
-            <w:shd w:fill="F6F8FA"/>
-            <w:tcMar>
-              <w:top w:w="65" w:type="dxa"/>
-              <w:bottom w:w="65" w:type="dxa"/>
-              <w:left w:w="95" w:type="dxa"/>
-              <w:right w:w="95" w:type="dxa"/>
-            </w:tcMar>
-          </w:tcPr>
-          <w:p>
-            <w:pPr>
-              <w:spacing w:after="0" w:before="0" w:line="259" w:lineRule="auto"/>
-            </w:pPr>
-            <w:r>
-              <w:rPr>
-                <w:rFonts w:ascii="Noto Sans CJK SC" w:hAnsi="Noto Sans CJK SC" w:eastAsia="Noto Sans CJK SC" w:cs="Noto Sans CJK SC"/>
-                <w:b w:val="0"/>
-                <w:color w:val="000000"/>
-                <w:sz w:val="19"/>
-              </w:rPr>
-              <w:t>M2 Vision &amp; Scope 与功能路线</w:t>
-            </w:r>
-          </w:p>
-        </w:tc>
-        <w:tc>
-          <w:tcPr>
-            <w:tcW w:type="dxa" w:w="2608"/>
-            <w:vAlign w:val="center"/>
-            <w:shd w:fill="F6F8FA"/>
-            <w:tcMar>
-              <w:top w:w="65" w:type="dxa"/>
-              <w:bottom w:w="65" w:type="dxa"/>
-              <w:left w:w="95" w:type="dxa"/>
-              <w:right w:w="95" w:type="dxa"/>
-            </w:tcMar>
-          </w:tcPr>
-          <w:p>
-            <w:pPr>
-              <w:spacing w:after="0" w:before="0" w:line="259" w:lineRule="auto"/>
-            </w:pPr>
-            <w:r>
-              <w:rPr>
-                <w:rFonts w:ascii="Noto Sans CJK SC" w:hAnsi="Noto Sans CJK SC" w:eastAsia="Noto Sans CJK SC" w:cs="Noto Sans CJK SC"/>
-                <w:b w:val="0"/>
-                <w:color w:val="000000"/>
-                <w:sz w:val="19"/>
-              </w:rPr>
-              <w:t>卓新烨</w:t>
-            </w:r>
-          </w:p>
-        </w:tc>
-        <w:tc>
-          <w:tcPr>
-            <w:tcW w:type="dxa" w:w="2608"/>
-            <w:vAlign w:val="center"/>
-            <w:shd w:fill="F6F8FA"/>
-            <w:tcMar>
-              <w:top w:w="65" w:type="dxa"/>
-              <w:bottom w:w="65" w:type="dxa"/>
-              <w:left w:w="95" w:type="dxa"/>
-              <w:right w:w="95" w:type="dxa"/>
-            </w:tcMar>
-          </w:tcPr>
-          <w:p>
-            <w:pPr>
-              <w:spacing w:after="0" w:before="0" w:line="259" w:lineRule="auto"/>
-            </w:pPr>
-            <w:r>
-              <w:rPr>
-                <w:rFonts w:ascii="Noto Sans CJK SC" w:hAnsi="Noto Sans CJK SC" w:eastAsia="Noto Sans CJK SC" w:cs="Noto Sans CJK SC"/>
-                <w:b w:val="0"/>
-                <w:color w:val="000000"/>
-                <w:sz w:val="19"/>
-              </w:rPr>
-              <w:t>莫远序</w:t>
-            </w:r>
-          </w:p>
-        </w:tc>
-      </w:tr>
-      <w:tr>
-        <w:trPr>
-          <w:cantSplit/>
-        </w:trPr>
-        <w:tc>
-          <w:tcPr>
-            <w:tcW w:type="dxa" w:w="4195"/>
-            <w:vAlign w:val="center"/>
-            <w:shd w:fill="FFFFFF"/>
-            <w:tcMar>
-              <w:top w:w="65" w:type="dxa"/>
-              <w:bottom w:w="65" w:type="dxa"/>
-              <w:left w:w="95" w:type="dxa"/>
-              <w:right w:w="95" w:type="dxa"/>
-            </w:tcMar>
-          </w:tcPr>
-          <w:p>
-            <w:pPr>
-              <w:spacing w:after="0" w:before="0" w:line="259" w:lineRule="auto"/>
-            </w:pPr>
-            <w:r>
-              <w:rPr>
-                <w:rFonts w:ascii="Noto Sans CJK SC" w:hAnsi="Noto Sans CJK SC" w:eastAsia="Noto Sans CJK SC" w:cs="Noto Sans CJK SC"/>
-                <w:b w:val="0"/>
-                <w:color w:val="000000"/>
-                <w:sz w:val="19"/>
-              </w:rPr>
-              <w:t>Proposal 汇报整理与主讲</w:t>
-            </w:r>
-          </w:p>
-        </w:tc>
-        <w:tc>
-          <w:tcPr>
-            <w:tcW w:type="dxa" w:w="2608"/>
-            <w:vAlign w:val="center"/>
-            <w:shd w:fill="FFFFFF"/>
-            <w:tcMar>
-              <w:top w:w="65" w:type="dxa"/>
-              <w:bottom w:w="65" w:type="dxa"/>
-              <w:left w:w="95" w:type="dxa"/>
-              <w:right w:w="95" w:type="dxa"/>
-            </w:tcMar>
-          </w:tcPr>
-          <w:p>
-            <w:pPr>
-              <w:spacing w:after="0" w:before="0" w:line="259" w:lineRule="auto"/>
-            </w:pPr>
-            <w:r>
-              <w:rPr>
-                <w:rFonts w:ascii="Noto Sans CJK SC" w:hAnsi="Noto Sans CJK SC" w:eastAsia="Noto Sans CJK SC" w:cs="Noto Sans CJK SC"/>
-                <w:b w:val="0"/>
-                <w:color w:val="000000"/>
-                <w:sz w:val="19"/>
-              </w:rPr>
-              <w:t>田亦洁</w:t>
-            </w:r>
-          </w:p>
-        </w:tc>
-        <w:tc>
-          <w:tcPr>
-            <w:tcW w:type="dxa" w:w="2608"/>
-            <w:vAlign w:val="center"/>
-            <w:shd w:fill="FFFFFF"/>
-            <w:tcMar>
-              <w:top w:w="65" w:type="dxa"/>
-              <w:bottom w:w="65" w:type="dxa"/>
-              <w:left w:w="95" w:type="dxa"/>
-              <w:right w:w="95" w:type="dxa"/>
-            </w:tcMar>
-          </w:tcPr>
-          <w:p>
-            <w:pPr>
-              <w:spacing w:after="0" w:before="0" w:line="259" w:lineRule="auto"/>
-            </w:pPr>
-            <w:r>
-              <w:rPr>
-                <w:rFonts w:ascii="Noto Sans CJK SC" w:hAnsi="Noto Sans CJK SC" w:eastAsia="Noto Sans CJK SC" w:cs="Noto Sans CJK SC"/>
-                <w:b w:val="0"/>
-                <w:color w:val="000000"/>
-                <w:sz w:val="19"/>
-              </w:rPr>
-              <w:t>莫远序</w:t>
-            </w:r>
-          </w:p>
-        </w:tc>
-      </w:tr>
-      <w:tr>
-        <w:trPr>
-          <w:cantSplit/>
-        </w:trPr>
-        <w:tc>
-          <w:tcPr>
-            <w:tcW w:type="dxa" w:w="4195"/>
-            <w:vAlign w:val="center"/>
-            <w:shd w:fill="F6F8FA"/>
-            <w:tcMar>
-              <w:top w:w="65" w:type="dxa"/>
-              <w:bottom w:w="65" w:type="dxa"/>
-              <w:left w:w="95" w:type="dxa"/>
-              <w:right w:w="95" w:type="dxa"/>
-            </w:tcMar>
-          </w:tcPr>
-          <w:p>
-            <w:pPr>
-              <w:spacing w:after="0" w:before="0" w:line="259" w:lineRule="auto"/>
-            </w:pPr>
-            <w:r>
-              <w:rPr>
-                <w:rFonts w:ascii="Noto Sans CJK SC" w:hAnsi="Noto Sans CJK SC" w:eastAsia="Noto Sans CJK SC" w:cs="Noto Sans CJK SC"/>
-                <w:b w:val="0"/>
-                <w:color w:val="000000"/>
-                <w:sz w:val="19"/>
-              </w:rPr>
-              <w:t>过程材料整理与文件检查</w:t>
-            </w:r>
-          </w:p>
-        </w:tc>
-        <w:tc>
-          <w:tcPr>
-            <w:tcW w:type="dxa" w:w="2608"/>
-            <w:vAlign w:val="center"/>
-            <w:shd w:fill="F6F8FA"/>
-            <w:tcMar>
-              <w:top w:w="65" w:type="dxa"/>
-              <w:bottom w:w="65" w:type="dxa"/>
-              <w:left w:w="95" w:type="dxa"/>
-              <w:right w:w="95" w:type="dxa"/>
-            </w:tcMar>
-          </w:tcPr>
-          <w:p>
-            <w:pPr>
-              <w:spacing w:after="0" w:before="0" w:line="259" w:lineRule="auto"/>
-            </w:pPr>
-            <w:r>
-              <w:rPr>
-                <w:rFonts w:ascii="Noto Sans CJK SC" w:hAnsi="Noto Sans CJK SC" w:eastAsia="Noto Sans CJK SC" w:cs="Noto Sans CJK SC"/>
-                <w:b w:val="0"/>
-                <w:color w:val="000000"/>
-                <w:sz w:val="19"/>
-              </w:rPr>
-              <w:t>黎志丽</w:t>
-            </w:r>
-          </w:p>
-        </w:tc>
-        <w:tc>
-          <w:tcPr>
-            <w:tcW w:type="dxa" w:w="2608"/>
-            <w:vAlign w:val="center"/>
-            <w:shd w:fill="F6F8FA"/>
-            <w:tcMar>
-              <w:top w:w="65" w:type="dxa"/>
-              <w:bottom w:w="65" w:type="dxa"/>
-              <w:left w:w="95" w:type="dxa"/>
-              <w:right w:w="95" w:type="dxa"/>
-            </w:tcMar>
-          </w:tcPr>
-          <w:p>
-            <w:pPr>
-              <w:spacing w:after="0" w:before="0" w:line="259" w:lineRule="auto"/>
-            </w:pPr>
-            <w:r>
-              <w:rPr>
-                <w:rFonts w:ascii="Noto Sans CJK SC" w:hAnsi="Noto Sans CJK SC" w:eastAsia="Noto Sans CJK SC" w:cs="Noto Sans CJK SC"/>
-                <w:b w:val="0"/>
-                <w:color w:val="000000"/>
-                <w:sz w:val="19"/>
-              </w:rPr>
-              <w:t>田亦洁</w:t>
-            </w:r>
-          </w:p>
-        </w:tc>
-      </w:tr>
-      <w:tr>
-        <w:trPr>
-          <w:cantSplit/>
-        </w:trPr>
-        <w:tc>
-          <w:tcPr>
-            <w:tcW w:type="dxa" w:w="4195"/>
-            <w:vAlign w:val="center"/>
-            <w:shd w:fill="FFFFFF"/>
-            <w:tcMar>
-              <w:top w:w="65" w:type="dxa"/>
-              <w:bottom w:w="65" w:type="dxa"/>
-              <w:left w:w="95" w:type="dxa"/>
-              <w:right w:w="95" w:type="dxa"/>
-            </w:tcMar>
-          </w:tcPr>
-          <w:p>
-            <w:pPr>
-              <w:spacing w:after="0" w:before="0" w:line="259" w:lineRule="auto"/>
-            </w:pPr>
-            <w:r>
-              <w:rPr>
-                <w:rFonts w:ascii="Noto Sans CJK SC" w:hAnsi="Noto Sans CJK SC" w:eastAsia="Noto Sans CJK SC" w:cs="Noto Sans CJK SC"/>
-                <w:b w:val="0"/>
-                <w:color w:val="000000"/>
-                <w:sz w:val="19"/>
-              </w:rPr>
-              <w:t>课程疑问跟进与最终提交</w:t>
-            </w:r>
-          </w:p>
-        </w:tc>
-        <w:tc>
-          <w:tcPr>
-            <w:tcW w:type="dxa" w:w="2608"/>
-            <w:vAlign w:val="center"/>
-            <w:shd w:fill="FFFFFF"/>
-            <w:tcMar>
-              <w:top w:w="65" w:type="dxa"/>
-              <w:bottom w:w="65" w:type="dxa"/>
-              <w:left w:w="95" w:type="dxa"/>
-              <w:right w:w="95" w:type="dxa"/>
-            </w:tcMar>
-          </w:tcPr>
-          <w:p>
-            <w:pPr>
-              <w:spacing w:after="0" w:before="0" w:line="259" w:lineRule="auto"/>
-            </w:pPr>
-            <w:r>
-              <w:rPr>
-                <w:rFonts w:ascii="Noto Sans CJK SC" w:hAnsi="Noto Sans CJK SC" w:eastAsia="Noto Sans CJK SC" w:cs="Noto Sans CJK SC"/>
-                <w:b w:val="0"/>
-                <w:color w:val="000000"/>
-                <w:sz w:val="19"/>
-              </w:rPr>
-              <w:t>莫远序</w:t>
-            </w:r>
-          </w:p>
-        </w:tc>
-        <w:tc>
-          <w:tcPr>
-            <w:tcW w:type="dxa" w:w="2608"/>
-            <w:vAlign w:val="center"/>
-            <w:shd w:fill="FFFFFF"/>
-            <w:tcMar>
-              <w:top w:w="65" w:type="dxa"/>
-              <w:bottom w:w="65" w:type="dxa"/>
-              <w:left w:w="95" w:type="dxa"/>
-              <w:right w:w="95" w:type="dxa"/>
-            </w:tcMar>
-          </w:tcPr>
-          <w:p>
-            <w:pPr>
-              <w:spacing w:after="0" w:before="0" w:line="259" w:lineRule="auto"/>
-            </w:pPr>
-            <w:r>
-              <w:rPr>
-                <w:rFonts w:ascii="Noto Sans CJK SC" w:hAnsi="Noto Sans CJK SC" w:eastAsia="Noto Sans CJK SC" w:cs="Noto Sans CJK SC"/>
-                <w:b w:val="0"/>
-                <w:color w:val="000000"/>
-                <w:sz w:val="19"/>
-              </w:rPr>
-              <w:t>黎志丽</w:t>
-            </w:r>
-          </w:p>
-        </w:tc>
-      </w:tr>
-    </w:tbl>
-    <w:p>
-      <w:pPr>
-        <w:spacing w:after="20" w:before="0" w:line="40" w:lineRule="exact"/>
-      </w:pPr>
-      <w:r>
-        <w:rPr>
-          <w:sz w:val="4"/>
-        </w:rPr>
+        <w:t>每位团队成员负责自己任务模块的实现、测试、文档攥写和相关素材汇总。若有问题与缺陷则按来源交回对应模块，不集中由组长补修；分配调整由组长结合实际决定。</w:t>
       </w:r>
     </w:p>
     <w:p>
@@ -1156,7 +595,7 @@
           <w:color w:val="000000"/>
           <w:sz w:val="20"/>
         </w:rPr>
-        <w:t>微信日常沟通，消息在 24 小时内回应，阻塞当天报告。莫远序每周二北京时间 20:00 召集 20–30 分钟例会，检查进展、产物、依赖与任务。首次会议登记为 10 月 6 日 20:00–21:00，纪要及截图已留档。黎志丽、卓新烨、田亦洁轮流记录，组长复核行动项。</w:t>
+        <w:t>使用微信群聊进行日常沟通与协调，团队约定消息应在 24 小时内回应，且开发遇到阻塞和问题时当天及时报告，便于合作解决，防止进度拖延。遇到的阻塞与问题优先由相关的小组成员协助解决，若超过两天没有任何解决途径，则由组长决定拆分、改派或调整计划。</w:t>
       </w:r>
     </w:p>
     <w:p>
@@ -1169,7 +608,7 @@
           <w:color w:val="000000"/>
           <w:sz w:val="20"/>
         </w:rPr>
-        <w:t>决定及行动项写入会议纪要，明确负责人和完成时间。真实纪要及经检查的截图存入 process/meetings/，使用其中的 meeting-template.md。阻塞先由相关成员协助，24 小时仍无解决路径时，由组长决定拆分、改派或调整计划。</w:t>
+        <w:t>例会由组长莫远序于每周二 20:00 召集，每次约 20-30 分钟，在例会上进行进展查验，集中敲定开发方案，讨论并解决遇到的问题，并在例会最后进行任务的布置与确认。每次例会由小组成员轮流记录会议纪要，会议纪要需记录会议中做出的决定与行动项，并详细记录各项任务负责人、预计完成时间、实际完成时间等。约定会议纪要及经检查的截图存入 process/meetings/，使用 meeting-template.md 作为会议纪要模板。</w:t>
       </w:r>
     </w:p>
     <w:p>
@@ -1196,7 +635,7 @@
           <w:color w:val="000000"/>
           <w:sz w:val="20"/>
         </w:rPr>
-        <w:t>里程碑约束阶段目标和期限，tickets 可随需求、缺陷和优化持续增加。任何成员均可提出任务，由组长决定是否接受、所属里程碑、优先级及迭代归属。新增工作计入原投入预算；若影响当前交付，需明确替换、推迟或取消的工作。</w:t>
+        <w:t>使用设定Milestone的方式约束阶段目标和期限，tickets 可随开发中实际需求、缺陷和优化持续增加。团队中任何成员均可提出任务，由组长决定是否接受、所属Milestone、优先级及迭代归属。新增工作若影响当前任务的交付，则需明确替换、推迟或取消的工作。</w:t>
       </w:r>
     </w:p>
     <w:p>
@@ -1209,7 +648,7 @@
           <w:color w:val="000000"/>
           <w:sz w:val="20"/>
         </w:rPr>
-        <w:t>统一工作链路为 grill-with-docs → to-spec → to-tickets → implement → code-review。新需求先采访、形成 spec，再确认拆分及阻塞依赖。已有 spec 下的缺陷或遗漏直接关联原 spec；范围、接口、数据格式、依赖或验收变化时先更新相关定义。</w:t>
+        <w:t>团队约定统一工作链路为 grill-with-docs → to-spec → to-tickets → implement → code-review。若有新需求先采访、形成 spec，再确认拆分及阻塞依赖。已有 spec 下的缺陷或遗漏直接关联原 spec；范围、接口、数据格式、依赖或验收变化时先更新相关定义。</w:t>
       </w:r>
     </w:p>
     <w:p>
@@ -1222,7 +661,7 @@
           <w:color w:val="000000"/>
           <w:sz w:val="20"/>
         </w:rPr>
-        <w:t>GitHub 保存技术定义、讨论与版本关联，Notion 只做实时进度看板，不重复保存正文。GitHub Issues 保存 spec、ticket 正文及讨论。成功发布的 spec 和 ticket 正文分别原样复制到 docs/specs/、process/tickets/。每个 ticket 单独保存，并可追溯至原 Issue 和所属 spec。每项任务须明确可独立检查的交付结果、主责、非作者复核人、期限、依赖及验收标准。</w:t>
+        <w:t>使用 GitHub 保存技术定义、讨论与版本关联，Notion 只作为实时进度看板，不重复保存正文。使用 GitHub Issues 保存 spec、ticket 正文及讨论。成功发布的 spec 和 ticket 正文分别原样复制到 docs/specs/、process/tickets/。每个 ticket 单独保存，并可追溯至原 Issue 和所属 spec。每项任务须明确可独立检查的交付结果、主责、非负责复核者、完成期限、依赖及验收标准。</w:t>
       </w:r>
     </w:p>
     <w:p>
@@ -1235,7 +674,7 @@
           <w:color w:val="000000"/>
           <w:sz w:val="18"/>
         </w:rPr>
-        <w:t>表 3 任务流转与完成依据</w:t>
+        <w:t>表 3 任务状态说明</w:t>
       </w:r>
     </w:p>
     <w:tbl>
@@ -1485,7 +924,7 @@
                 <w:color w:val="000000"/>
                 <w:sz w:val="19"/>
               </w:rPr>
-              <w:t>定义、负责人及验收明确</w:t>
+              <w:t>明确定义、负责人及验收要求</w:t>
             </w:r>
           </w:p>
         </w:tc>
@@ -1571,7 +1010,7 @@
                 <w:color w:val="000000"/>
                 <w:sz w:val="19"/>
               </w:rPr>
-              <w:t>已领取且依赖满足</w:t>
+              <w:t>任务已领取且依赖满足</w:t>
             </w:r>
           </w:p>
         </w:tc>
@@ -1598,7 +1037,7 @@
                 <w:color w:val="000000"/>
                 <w:sz w:val="19"/>
               </w:rPr>
-              <w:t>实现、文档和自测，及时报告阻塞</w:t>
+              <w:t>任务实现、相关文档攥写和成果自测，若有阻塞及时报告</w:t>
             </w:r>
           </w:p>
         </w:tc>
@@ -1684,7 +1123,7 @@
                 <w:color w:val="000000"/>
                 <w:sz w:val="19"/>
               </w:rPr>
-              <w:t>AI 审查及非作者复核；问题退回修改</w:t>
+              <w:t>AI 审查及非负责者复核；若有问题退回修改</w:t>
             </w:r>
           </w:p>
         </w:tc>
@@ -1743,7 +1182,7 @@
                 <w:color w:val="000000"/>
                 <w:sz w:val="19"/>
               </w:rPr>
-              <w:t>验收通过，合并及必要验证完成</w:t>
+              <w:t>验收通过，合并到main支线及完成必要验证</w:t>
             </w:r>
           </w:p>
         </w:tc>
@@ -1882,7 +1321,7 @@
           <w:color w:val="000000"/>
           <w:sz w:val="20"/>
         </w:rPr>
-        <w:t>阻塞单独记录原因、所需协助和解除条件，保留原流转状态。依赖全部满足后才开工；多人只并行处理边界明确、不会争改同一核心接口的任务。ready-for-agent 是适合交给 Agent 的准备标签，不代表正在开发或已完成。</w:t>
+        <w:t>团队约定如遇到阻塞需单独记录原因、所需协助和解除条件，并保留原流转状态，等到依赖全部满足后才开工。任务中若涉及多人合作完成，则需明确并行处理边界、防止争改同一核心接口情况出现。ready-for-agent 是指适合交给 Agent 的准备标签，不代表正在开发或已完成。</w:t>
       </w:r>
     </w:p>
     <w:p>
@@ -1895,7 +1334,7 @@
           <w:color w:val="000000"/>
           <w:sz w:val="20"/>
         </w:rPr>
-        <w:t>验收标准采用可检查的勾选项。作者提供产物和验证证据，非作者逐条核对后勾选；代码任务检查功能、异常及必要测试，文档任务检查内容完整性、来源和一致性。未通过的项先修复。</w:t>
+        <w:t>对于验收的标准约定采用可检查的勾选项。任务负责者提供产物和验证证据，非负责者逐条核对后勾选；对于代码任务主要检查功能、是否存在异常及是否通过必要测试，对于文档任务主要检查内容完整性、来源和内容一致性。未通过的项需先修复。</w:t>
       </w:r>
     </w:p>
     <w:p>
@@ -1908,7 +1347,7 @@
           <w:color w:val="000000"/>
           <w:sz w:val="20"/>
         </w:rPr>
-        <w:t>Notion 是任务实时状态的唯一准本，维护任务编号、里程碑、迭代、主责、复核人、期限、状态、阻塞及 Issue/PR 链接。莫远序维护结构和优先级，成员在领取、送审、交付或阻塞时更新，例会前补齐进展。Notion 不重复维护 spec、ticket 正文。</w:t>
+        <w:t>使用 Notion 作为任务实时状态的唯一准本，能够维护任务编号、Milestone、迭代、主责、复核人、期限、状态、阻塞及 Issue/PR 链接等。组长主要负责维护结构和优先级，团队成员在领取、送审、交付或阻塞时更新，并在例会前补齐进展。</w:t>
       </w:r>
     </w:p>
     <w:p>
@@ -1921,7 +1360,7 @@
           <w:color w:val="000000"/>
           <w:sz w:val="20"/>
         </w:rPr>
-        <w:t>AI 在获授权的任务操作中同步更新已关联的 Notion 记录。缺少关联、权限或更新失败时，报告未同步项，由负责人补录；不宣称同步成功。此方式按需执行，不持续后台运行。阶段快照注明导出时间和交付版本，保存到 process/snapshots/，用于过程留档。</w:t>
+        <w:t>使用 AI 在获授权的任务操作中同步更新已关联的 Notion 记录。当缺少关联、缺少权限或更新失败时，报告未同步项，由负责人补录。注意此方式按需执行，并不持续在后台运行。阶段快照注明导出时间和交付版本，保存到 process/snapshots/，用于过程留档。</w:t>
       </w:r>
     </w:p>
     <w:p>
@@ -1936,7 +1375,7 @@
           <w:color w:val="000000"/>
           <w:sz w:val="26"/>
         </w:rPr>
-        <w:t>4 版本控制与协作开发</w:t>
+        <w:t>4 版本控制与协作开发准则</w:t>
       </w:r>
     </w:p>
     <w:p>
@@ -1949,7 +1388,7 @@
           <w:color w:val="000000"/>
           <w:sz w:val="20"/>
         </w:rPr>
-        <w:t>私有仓库为 kenqia/locomo-dynamic-memory，仅授权成员可修改。邀请全部成员后检查读取、创建分支和参与 PR 的权限；成员使用自己的账号提交，从首份文档草稿开始保存版本历史。main 保存经复核的产物，每项 ticket 使用一个短期分支，分支名应能识别任务。</w:t>
+        <w:t>团队在GitHub中建立私有仓库： kenqia/locomo-dynamic-memory，限定仅授权成员可修改，并在邀请全部成员后检查读取、创建分支和参与 PR 的权限无问题。每位成员使用自己的账号提交，从首份文档草稿开始保存版本历史。main 保存经复核的产物，每项 ticket 使用一个短期分支，分支名应能识别任务。</w:t>
       </w:r>
     </w:p>
     <w:p>
@@ -1962,7 +1401,7 @@
           <w:color w:val="000000"/>
           <w:sz w:val="20"/>
         </w:rPr>
-        <w:t>作者在任务分支实现与自测，提交待审版本后发起 PR，并写明关联 ticket、具体改动、验证命令或检查方法、实际结果及剩余问题。code-review 使用明确的基准版本比较已提交的 HEAD，检查项目规范与原 spec；未提交改动应先纳入待审版本，避免漏审。修复后提交新版本并重新检查。</w:t>
+        <w:t>任务负责者在任务分支实现与自测，提交待审版本后发起 PR，并写明关联 ticket、具体改动、验证命令或检查方法、实际结果及剩余问题。code-review 使用明确的基准版本比较已提交的 HEAD，检查项目规范与原 spec；未提交改动应先纳入待审版本，避免漏审。修复后提交新版本并重新检查。</w:t>
       </w:r>
     </w:p>
     <w:p>
@@ -1975,7 +1414,7 @@
           <w:color w:val="000000"/>
           <w:sz w:val="20"/>
         </w:rPr>
-        <w:t>普通改动经至少一位非作者复核后，由作者合并。项目范围、技术栈、公共接口、数据格式、验收标准及阶段交付版本由莫远序最终批准。存在分歧时记录理由，由组长裁决；测试失败或验收不满足的交付先修复。AI 审查不能替代非作者成员复核。</w:t>
+        <w:t>团队约定普通改动经至少一位非负责者复核后，由任务负责者合并。项目范围、技术栈、公共接口、数据格式、验收标准及阶段交付版本由组长进行最终批准。存在分歧时记录理由，由组长裁决；测试失败或验收不满足的交付先修复。AI 审查不能替代非作者成员复核。</w:t>
       </w:r>
     </w:p>
     <w:p>
@@ -1988,7 +1427,7 @@
           <w:color w:val="000000"/>
           <w:sz w:val="20"/>
         </w:rPr>
-        <w:t>提交格式为“类型: 具体改动”，类型使用 docs、feat、fix、test、chore，例如“docs: 补充有效记忆验收场景”。PR 关联任务编号，提交描述实际变化。阶段定稿用 milestone-1-v1 等 tag 标识，修订递增版本；交付文件与实际 tag、commit 保持对应。</w:t>
+        <w:t>团队约定提交格式为“类型: 具体改动”，类型使用 docs、feat、fix、test、chore，例如“docs: 补充有效记忆验收场景”。PR 关联任务编号，提交描述实际变化。阶段定稿用 milestone-1-v1 等 tag 标识，修订递增版本；交付文件与实际 tag、commit 保持对应。</w:t>
       </w:r>
     </w:p>
     <w:p>
@@ -2001,7 +1440,7 @@
           <w:color w:val="000000"/>
           <w:sz w:val="20"/>
         </w:rPr>
-        <w:t>团队先执行上述操作约定，新增强制设置另行确认。发生接口变更时先更新相关 spec、通知受影响成员，再继续开发；保留旧版本和变更原因，必要时通过修复或 revert 恢复已确认行为。</w:t>
+        <w:t>团队先执行上述操作约定，若有新增另行确认。发生接口变更时先更新相关 spec、通知受影响成员，再继续开发；保留旧版本和变更原因，必要时通过修复或 revert 恢复已确认行为。</w:t>
       </w:r>
     </w:p>
     <w:p>
@@ -2028,7 +1467,7 @@
           <w:color w:val="000000"/>
           <w:sz w:val="20"/>
         </w:rPr>
-        <w:t>四位成员统一使用仓库内置 skills，实际路径为 .agents/skills/。grill-with-docs 用于澄清需求并记录已确定术语和决定；to-spec 形成规格；to-tickets 将规格拆成可独立验收的任务并声明依赖；implement 按已确认任务实现、自测和提交，过程中调用 code-review。各环节完成后复用已有结论，不为小修订重复整套采访；小修订直接关联现有定义，避免流程成本挤占开发。</w:t>
+        <w:t>团队中所有成员统一使用仓库内置 skills，实际路径为 .agents/skills/。grill-with-docs 用于澄清需求并记录已确定术语和决定；to-spec 形成规格；to-tickets 将规格拆成可独立验收的任务并声明依赖；implement 按已确认任务实现、自测和提交，过程中调用 code-review。各环节完成后复用已有结论，不为小修订重复整套采访；小修订直接关联现有定义，避免流程成本挤占开发。</w:t>
       </w:r>
     </w:p>
     <w:p>
@@ -2041,7 +1480,7 @@
           <w:color w:val="000000"/>
           <w:sz w:val="20"/>
         </w:rPr>
-        <w:t>作者必须理解 AI 产物，能够解释模块输入输出、来源映射、状态关系和验证结果。新术语记入 CONTEXT.md；团队流程决定保存在 docs/decisions/，架构与领域取舍按既有规则写入 docs/adr/，具体设计存入 docs/design/。任务定义、设计和过程记录通过链接关联。</w:t>
+        <w:t>任务负责者必须理解 AI 产物，能够解释模块输入输出、来源映射、状态关系和验证结果。团队约定新术语记入 CONTEXT.md，团队流程保存在 docs/decisions/，架构与领域取舍按既有规则写入 docs/adr/，具体设计存入 docs/design/，同时任务定义、设计和过程记录都需要通过链接关联。</w:t>
       </w:r>
     </w:p>
     <w:p>
@@ -2054,7 +1493,7 @@
           <w:color w:val="000000"/>
           <w:sz w:val="20"/>
         </w:rPr>
-        <w:t>不提交真实 API key、token、cookie、真实 .env、私密聊天或含凭据的日志；配置示例仅使用无真实值的 .env.example。截图检查共享范围，去除无关通知和私人信息。课程 QA 标准答案只用于评价，不混入可检索记忆，也不用于独立测试集调参。</w:t>
+        <w:t>团队约定不能提交真实 API key、token、cookie、真实 .env、私密聊天或含凭据的日志；配置示例仅使用无真实值的 .env.example。若有截图需要检查共享范围，去除无关通知和私人信息。</w:t>
       </w:r>
     </w:p>
     <w:p>
@@ -2067,7 +1506,7 @@
           <w:color w:val="000000"/>
           <w:sz w:val="20"/>
         </w:rPr>
-        <w:t>发布 Issues、推送、修改权限或正式提交须在明确授权范围内执行。</w:t>
+        <w:t>团队约定发布 Issues、推送、修改权限或正式提交须在明确授权范围内执行。</w:t>
       </w:r>
     </w:p>
     <w:p>
@@ -2095,7 +1534,7 @@
           <w:color w:val="000000"/>
           <w:sz w:val="20"/>
         </w:rPr>
-        <w:t>每个里程碑安排三轮：第一轮形成可检查产物，第二轮优化提升，第三轮验收收尾，之后另留缓冲。日期均为 2026 年。优化优先处理已有问题与产物质量，新增功能必须重新评估范围与预算；缓冲用于修复、环境和提交检查。</w:t>
+        <w:t>对于每个 Milestone 安排三轮行动：第一轮初步形成可检查产物，第二轮进行优化提升，第三轮进行验收收尾，之后另留缓冲。在优化阶段优先处理已有问题与产物质量，若有新增功能必须重新评估；缓冲阶段则用于修复、环境和提交检查。</w:t>
       </w:r>
     </w:p>
     <w:p>
@@ -2162,7 +1601,7 @@
           <w:color w:val="000000"/>
           <w:sz w:val="20"/>
         </w:rPr>
-        <w:t>组长在例会中核对总量并调整优先级。某个功能的需求与验收先确定，再开展对应实现，不等待全部需求文档统一结束。</w:t>
+        <w:t>组长在例会中核对总量并调整优先级。对于某个功能的需求与验收先确定，再开展对应实现。</w:t>
       </w:r>
     </w:p>
     <w:p>
@@ -2737,7 +2176,7 @@
           <w:color w:val="000000"/>
           <w:sz w:val="20"/>
         </w:rPr>
-        <w:t>跨阶段复核安排由组长在分配 tickets 时确定，每项任务必须有非作者复核人。阶段结束时主责提交产物和证据，复核人检查；未通过的必做项进入缓冲，不能用扩展功能替代。具体任务可随阶段进展增补，实时状态以 Notion 为准。</w:t>
+        <w:t>跨阶段复核安排由组长在分配 tickets 时确定，每项任务必须有非负责复核人。阶段结束时主责提交产物和证据，复核人检查；未通过的必做项进入缓冲，不能用扩展功能替代。具体任务可随阶段进展增补，实时状态以 Notion 为准。</w:t>
       </w:r>
     </w:p>
     <w:p>
@@ -2751,568 +2190,7 @@
           <w:color w:val="000000"/>
           <w:sz w:val="26"/>
         </w:rPr>
-        <w:t>7 近期执行与过程留档</w:t>
-      </w:r>
-    </w:p>
-    <w:p>
-      <w:pPr>
-        <w:pStyle w:val="Caption"/>
-      </w:pPr>
-      <w:r>
-        <w:rPr>
-          <w:rFonts w:ascii="Noto Sans CJK SC" w:hAnsi="Noto Sans CJK SC" w:eastAsia="Noto Sans CJK SC" w:cs="Noto Sans CJK SC"/>
-          <w:color w:val="000000"/>
-          <w:sz w:val="18"/>
-        </w:rPr>
-        <w:t>表 5 M1 和 M2 近期行动安排</w:t>
-      </w:r>
-    </w:p>
-    <w:tbl>
-      <w:tblPr>
-        <w:tblW w:type="auto" w:w="0"/>
-        <w:jc w:val="center"/>
-        <w:tblLayout w:type="fixed"/>
-        <w:tblLook w:firstColumn="1" w:firstRow="1" w:lastColumn="0" w:lastRow="0" w:noHBand="0" w:noVBand="1" w:val="04A0"/>
-        <w:tblBorders>
-          <w:top w:val="single" w:sz="4" w:color="D9D9D9"/>
-          <w:left w:val="single" w:sz="4" w:color="D9D9D9"/>
-          <w:bottom w:val="single" w:sz="4" w:color="D9D9D9"/>
-          <w:right w:val="single" w:sz="4" w:color="D9D9D9"/>
-          <w:insideH w:val="single" w:sz="4" w:color="D9D9D9"/>
-          <w:insideV w:val="single" w:sz="4" w:color="D9D9D9"/>
-        </w:tblBorders>
-      </w:tblPr>
-      <w:tblGrid>
-        <w:gridCol w:w="2041"/>
-        <w:gridCol w:w="4309"/>
-        <w:gridCol w:w="3061"/>
-      </w:tblGrid>
-      <w:tr>
-        <w:trPr>
-          <w:cantSplit/>
-          <w:tblHeader/>
-        </w:trPr>
-        <w:tc>
-          <w:tcPr>
-            <w:tcW w:type="dxa" w:w="2041"/>
-            <w:vAlign w:val="center"/>
-            <w:shd w:fill="E7EDF4"/>
-            <w:tcMar>
-              <w:top w:w="65" w:type="dxa"/>
-              <w:bottom w:w="65" w:type="dxa"/>
-              <w:left w:w="95" w:type="dxa"/>
-              <w:right w:w="95" w:type="dxa"/>
-            </w:tcMar>
-          </w:tcPr>
-          <w:p>
-            <w:pPr>
-              <w:spacing w:after="0" w:before="0" w:line="259" w:lineRule="auto"/>
-            </w:pPr>
-            <w:r>
-              <w:rPr>
-                <w:rFonts w:ascii="Noto Sans CJK SC" w:hAnsi="Noto Sans CJK SC" w:eastAsia="Noto Sans CJK SC" w:cs="Noto Sans CJK SC"/>
-                <w:b/>
-                <w:color w:val="000000"/>
-                <w:sz w:val="19"/>
-              </w:rPr>
-              <w:t>时间</w:t>
-            </w:r>
-          </w:p>
-        </w:tc>
-        <w:tc>
-          <w:tcPr>
-            <w:tcW w:type="dxa" w:w="4309"/>
-            <w:vAlign w:val="center"/>
-            <w:shd w:fill="E7EDF4"/>
-            <w:tcMar>
-              <w:top w:w="65" w:type="dxa"/>
-              <w:bottom w:w="65" w:type="dxa"/>
-              <w:left w:w="95" w:type="dxa"/>
-              <w:right w:w="95" w:type="dxa"/>
-            </w:tcMar>
-          </w:tcPr>
-          <w:p>
-            <w:pPr>
-              <w:spacing w:after="0" w:before="0" w:line="259" w:lineRule="auto"/>
-            </w:pPr>
-            <w:r>
-              <w:rPr>
-                <w:rFonts w:ascii="Noto Sans CJK SC" w:hAnsi="Noto Sans CJK SC" w:eastAsia="Noto Sans CJK SC" w:cs="Noto Sans CJK SC"/>
-                <w:b/>
-                <w:color w:val="000000"/>
-                <w:sz w:val="19"/>
-              </w:rPr>
-              <w:t>行动项</w:t>
-            </w:r>
-          </w:p>
-        </w:tc>
-        <w:tc>
-          <w:tcPr>
-            <w:tcW w:type="dxa" w:w="3061"/>
-            <w:vAlign w:val="center"/>
-            <w:shd w:fill="E7EDF4"/>
-            <w:tcMar>
-              <w:top w:w="65" w:type="dxa"/>
-              <w:bottom w:w="65" w:type="dxa"/>
-              <w:left w:w="95" w:type="dxa"/>
-              <w:right w:w="95" w:type="dxa"/>
-            </w:tcMar>
-          </w:tcPr>
-          <w:p>
-            <w:pPr>
-              <w:spacing w:after="0" w:before="0" w:line="259" w:lineRule="auto"/>
-            </w:pPr>
-            <w:r>
-              <w:rPr>
-                <w:rFonts w:ascii="Noto Sans CJK SC" w:hAnsi="Noto Sans CJK SC" w:eastAsia="Noto Sans CJK SC" w:cs="Noto Sans CJK SC"/>
-                <w:b/>
-                <w:color w:val="000000"/>
-                <w:sz w:val="19"/>
-              </w:rPr>
-              <w:t>主责与复核</w:t>
-            </w:r>
-          </w:p>
-        </w:tc>
-      </w:tr>
-      <w:tr>
-        <w:trPr>
-          <w:cantSplit/>
-        </w:trPr>
-        <w:tc>
-          <w:tcPr>
-            <w:tcW w:type="dxa" w:w="2041"/>
-            <w:vAlign w:val="center"/>
-            <w:shd w:fill="FFFFFF"/>
-            <w:tcMar>
-              <w:top w:w="65" w:type="dxa"/>
-              <w:bottom w:w="65" w:type="dxa"/>
-              <w:left w:w="95" w:type="dxa"/>
-              <w:right w:w="95" w:type="dxa"/>
-            </w:tcMar>
-          </w:tcPr>
-          <w:p>
-            <w:pPr>
-              <w:spacing w:after="0" w:before="0" w:line="259" w:lineRule="auto"/>
-            </w:pPr>
-            <w:r>
-              <w:rPr>
-                <w:rFonts w:ascii="Noto Sans CJK SC" w:hAnsi="Noto Sans CJK SC" w:eastAsia="Noto Sans CJK SC" w:cs="Noto Sans CJK SC"/>
-                <w:b w:val="0"/>
-                <w:color w:val="000000"/>
-                <w:sz w:val="19"/>
-              </w:rPr>
-              <w:t>10/5–10/6</w:t>
-            </w:r>
-          </w:p>
-        </w:tc>
-        <w:tc>
-          <w:tcPr>
-            <w:tcW w:type="dxa" w:w="4309"/>
-            <w:vAlign w:val="center"/>
-            <w:shd w:fill="FFFFFF"/>
-            <w:tcMar>
-              <w:top w:w="65" w:type="dxa"/>
-              <w:bottom w:w="65" w:type="dxa"/>
-              <w:left w:w="95" w:type="dxa"/>
-              <w:right w:w="95" w:type="dxa"/>
-            </w:tcMar>
-          </w:tcPr>
-          <w:p>
-            <w:pPr>
-              <w:spacing w:after="0" w:before="0" w:line="259" w:lineRule="auto"/>
-            </w:pPr>
-            <w:r>
-              <w:rPr>
-                <w:rFonts w:ascii="Noto Sans CJK SC" w:hAnsi="Noto Sans CJK SC" w:eastAsia="Noto Sans CJK SC" w:cs="Noto Sans CJK SC"/>
-                <w:b w:val="0"/>
-                <w:color w:val="000000"/>
-                <w:sz w:val="19"/>
-              </w:rPr>
-              <w:t>完成流程正文；检查成员仓库和 Notion 访问；准备启动会；起草提案与汇报</w:t>
-            </w:r>
-          </w:p>
-        </w:tc>
-        <w:tc>
-          <w:tcPr>
-            <w:tcW w:type="dxa" w:w="3061"/>
-            <w:vAlign w:val="center"/>
-            <w:shd w:fill="FFFFFF"/>
-            <w:tcMar>
-              <w:top w:w="65" w:type="dxa"/>
-              <w:bottom w:w="65" w:type="dxa"/>
-              <w:left w:w="95" w:type="dxa"/>
-              <w:right w:w="95" w:type="dxa"/>
-            </w:tcMar>
-          </w:tcPr>
-          <w:p>
-            <w:pPr>
-              <w:spacing w:after="0" w:before="0" w:line="259" w:lineRule="auto"/>
-            </w:pPr>
-            <w:r>
-              <w:rPr>
-                <w:rFonts w:ascii="Noto Sans CJK SC" w:hAnsi="Noto Sans CJK SC" w:eastAsia="Noto Sans CJK SC" w:cs="Noto Sans CJK SC"/>
-                <w:b w:val="0"/>
-                <w:color w:val="000000"/>
-                <w:sz w:val="19"/>
-              </w:rPr>
-              <w:t>莫远序组织；各材料按表 2 分工</w:t>
-            </w:r>
-          </w:p>
-        </w:tc>
-      </w:tr>
-      <w:tr>
-        <w:trPr>
-          <w:cantSplit/>
-        </w:trPr>
-        <w:tc>
-          <w:tcPr>
-            <w:tcW w:type="dxa" w:w="2041"/>
-            <w:vAlign w:val="center"/>
-            <w:shd w:fill="F6F8FA"/>
-            <w:tcMar>
-              <w:top w:w="65" w:type="dxa"/>
-              <w:bottom w:w="65" w:type="dxa"/>
-              <w:left w:w="95" w:type="dxa"/>
-              <w:right w:w="95" w:type="dxa"/>
-            </w:tcMar>
-          </w:tcPr>
-          <w:p>
-            <w:pPr>
-              <w:spacing w:after="0" w:before="0" w:line="259" w:lineRule="auto"/>
-            </w:pPr>
-            <w:r>
-              <w:rPr>
-                <w:rFonts w:ascii="Noto Sans CJK SC" w:hAnsi="Noto Sans CJK SC" w:eastAsia="Noto Sans CJK SC" w:cs="Noto Sans CJK SC"/>
-                <w:b w:val="0"/>
-                <w:color w:val="000000"/>
-                <w:sz w:val="19"/>
-              </w:rPr>
-              <w:t>10/6 20:00–21:00</w:t>
-            </w:r>
-          </w:p>
-        </w:tc>
-        <w:tc>
-          <w:tcPr>
-            <w:tcW w:type="dxa" w:w="4309"/>
-            <w:vAlign w:val="center"/>
-            <w:shd w:fill="F6F8FA"/>
-            <w:tcMar>
-              <w:top w:w="65" w:type="dxa"/>
-              <w:bottom w:w="65" w:type="dxa"/>
-              <w:left w:w="95" w:type="dxa"/>
-              <w:right w:w="95" w:type="dxa"/>
-            </w:tcMar>
-          </w:tcPr>
-          <w:p>
-            <w:pPr>
-              <w:spacing w:after="0" w:before="0" w:line="259" w:lineRule="auto"/>
-            </w:pPr>
-            <w:r>
-              <w:rPr>
-                <w:rFonts w:ascii="Noto Sans CJK SC" w:hAnsi="Noto Sans CJK SC" w:eastAsia="Noto Sans CJK SC" w:cs="Noto Sans CJK SC"/>
-                <w:b w:val="0"/>
-                <w:color w:val="000000"/>
-                <w:sz w:val="19"/>
-              </w:rPr>
-              <w:t>首次例会已举行，讨论任务安排与 M2 候选方案，纪要及四人入会截图已留档</w:t>
-            </w:r>
-          </w:p>
-        </w:tc>
-        <w:tc>
-          <w:tcPr>
-            <w:tcW w:type="dxa" w:w="3061"/>
-            <w:vAlign w:val="center"/>
-            <w:shd w:fill="F6F8FA"/>
-            <w:tcMar>
-              <w:top w:w="65" w:type="dxa"/>
-              <w:bottom w:w="65" w:type="dxa"/>
-              <w:left w:w="95" w:type="dxa"/>
-              <w:right w:w="95" w:type="dxa"/>
-            </w:tcMar>
-          </w:tcPr>
-          <w:p>
-            <w:pPr>
-              <w:spacing w:after="0" w:before="0" w:line="259" w:lineRule="auto"/>
-            </w:pPr>
-            <w:r>
-              <w:rPr>
-                <w:rFonts w:ascii="Noto Sans CJK SC" w:hAnsi="Noto Sans CJK SC" w:eastAsia="Noto Sans CJK SC" w:cs="Noto Sans CJK SC"/>
-                <w:b w:val="0"/>
-                <w:color w:val="000000"/>
-                <w:sz w:val="19"/>
-              </w:rPr>
-              <w:t>莫远序主持；黎志丽记录</w:t>
-            </w:r>
-          </w:p>
-        </w:tc>
-      </w:tr>
-      <w:tr>
-        <w:trPr>
-          <w:cantSplit/>
-        </w:trPr>
-        <w:tc>
-          <w:tcPr>
-            <w:tcW w:type="dxa" w:w="2041"/>
-            <w:vAlign w:val="center"/>
-            <w:shd w:fill="FFFFFF"/>
-            <w:tcMar>
-              <w:top w:w="65" w:type="dxa"/>
-              <w:bottom w:w="65" w:type="dxa"/>
-              <w:left w:w="95" w:type="dxa"/>
-              <w:right w:w="95" w:type="dxa"/>
-            </w:tcMar>
-          </w:tcPr>
-          <w:p>
-            <w:pPr>
-              <w:spacing w:after="0" w:before="0" w:line="259" w:lineRule="auto"/>
-            </w:pPr>
-            <w:r>
-              <w:rPr>
-                <w:rFonts w:ascii="Noto Sans CJK SC" w:hAnsi="Noto Sans CJK SC" w:eastAsia="Noto Sans CJK SC" w:cs="Noto Sans CJK SC"/>
-                <w:b w:val="0"/>
-                <w:color w:val="000000"/>
-                <w:sz w:val="19"/>
-              </w:rPr>
-              <w:t>10/7</w:t>
-            </w:r>
-          </w:p>
-        </w:tc>
-        <w:tc>
-          <w:tcPr>
-            <w:tcW w:type="dxa" w:w="4309"/>
-            <w:vAlign w:val="center"/>
-            <w:shd w:fill="FFFFFF"/>
-            <w:tcMar>
-              <w:top w:w="65" w:type="dxa"/>
-              <w:bottom w:w="65" w:type="dxa"/>
-              <w:left w:w="95" w:type="dxa"/>
-              <w:right w:w="95" w:type="dxa"/>
-            </w:tcMar>
-          </w:tcPr>
-          <w:p>
-            <w:pPr>
-              <w:spacing w:after="0" w:before="0" w:line="259" w:lineRule="auto"/>
-            </w:pPr>
-            <w:r>
-              <w:rPr>
-                <w:rFonts w:ascii="Noto Sans CJK SC" w:hAnsi="Noto Sans CJK SC" w:eastAsia="Noto Sans CJK SC" w:cs="Noto Sans CJK SC"/>
-                <w:b w:val="0"/>
-                <w:color w:val="000000"/>
-                <w:sz w:val="19"/>
-              </w:rPr>
-              <w:t>优化 M1 可执行性；核对提案范围、评测计划、工作量及相互依赖</w:t>
-            </w:r>
-          </w:p>
-        </w:tc>
-        <w:tc>
-          <w:tcPr>
-            <w:tcW w:type="dxa" w:w="3061"/>
-            <w:vAlign w:val="center"/>
-            <w:shd w:fill="FFFFFF"/>
-            <w:tcMar>
-              <w:top w:w="65" w:type="dxa"/>
-              <w:bottom w:w="65" w:type="dxa"/>
-              <w:left w:w="95" w:type="dxa"/>
-              <w:right w:w="95" w:type="dxa"/>
-            </w:tcMar>
-          </w:tcPr>
-          <w:p>
-            <w:pPr>
-              <w:spacing w:after="0" w:before="0" w:line="259" w:lineRule="auto"/>
-            </w:pPr>
-            <w:r>
-              <w:rPr>
-                <w:rFonts w:ascii="Noto Sans CJK SC" w:hAnsi="Noto Sans CJK SC" w:eastAsia="Noto Sans CJK SC" w:cs="Noto Sans CJK SC"/>
-                <w:b w:val="0"/>
-                <w:color w:val="000000"/>
-                <w:sz w:val="19"/>
-              </w:rPr>
-              <w:t>各主责修改；指定非作者复核</w:t>
-            </w:r>
-          </w:p>
-        </w:tc>
-      </w:tr>
-      <w:tr>
-        <w:trPr>
-          <w:cantSplit/>
-        </w:trPr>
-        <w:tc>
-          <w:tcPr>
-            <w:tcW w:type="dxa" w:w="2041"/>
-            <w:vAlign w:val="center"/>
-            <w:shd w:fill="F6F8FA"/>
-            <w:tcMar>
-              <w:top w:w="65" w:type="dxa"/>
-              <w:bottom w:w="65" w:type="dxa"/>
-              <w:left w:w="95" w:type="dxa"/>
-              <w:right w:w="95" w:type="dxa"/>
-            </w:tcMar>
-          </w:tcPr>
-          <w:p>
-            <w:pPr>
-              <w:spacing w:after="0" w:before="0" w:line="259" w:lineRule="auto"/>
-            </w:pPr>
-            <w:r>
-              <w:rPr>
-                <w:rFonts w:ascii="Noto Sans CJK SC" w:hAnsi="Noto Sans CJK SC" w:eastAsia="Noto Sans CJK SC" w:cs="Noto Sans CJK SC"/>
-                <w:b w:val="0"/>
-                <w:color w:val="000000"/>
-                <w:sz w:val="19"/>
-              </w:rPr>
-              <w:t>10/8</w:t>
-            </w:r>
-          </w:p>
-        </w:tc>
-        <w:tc>
-          <w:tcPr>
-            <w:tcW w:type="dxa" w:w="4309"/>
-            <w:vAlign w:val="center"/>
-            <w:shd w:fill="F6F8FA"/>
-            <w:tcMar>
-              <w:top w:w="65" w:type="dxa"/>
-              <w:bottom w:w="65" w:type="dxa"/>
-              <w:left w:w="95" w:type="dxa"/>
-              <w:right w:w="95" w:type="dxa"/>
-            </w:tcMar>
-          </w:tcPr>
-          <w:p>
-            <w:pPr>
-              <w:spacing w:after="0" w:before="0" w:line="259" w:lineRule="auto"/>
-            </w:pPr>
-            <w:r>
-              <w:rPr>
-                <w:rFonts w:ascii="Noto Sans CJK SC" w:hAnsi="Noto Sans CJK SC" w:eastAsia="Noto Sans CJK SC" w:cs="Noto Sans CJK SC"/>
-                <w:b w:val="0"/>
-                <w:color w:val="000000"/>
-                <w:sz w:val="19"/>
-              </w:rPr>
-              <w:t>收尾验收，检查文档与 PDF；完成试讲、文件一致性与命名检查</w:t>
-            </w:r>
-          </w:p>
-        </w:tc>
-        <w:tc>
-          <w:tcPr>
-            <w:tcW w:type="dxa" w:w="3061"/>
-            <w:vAlign w:val="center"/>
-            <w:shd w:fill="F6F8FA"/>
-            <w:tcMar>
-              <w:top w:w="65" w:type="dxa"/>
-              <w:bottom w:w="65" w:type="dxa"/>
-              <w:left w:w="95" w:type="dxa"/>
-              <w:right w:w="95" w:type="dxa"/>
-            </w:tcMar>
-          </w:tcPr>
-          <w:p>
-            <w:pPr>
-              <w:spacing w:after="0" w:before="0" w:line="259" w:lineRule="auto"/>
-            </w:pPr>
-            <w:r>
-              <w:rPr>
-                <w:rFonts w:ascii="Noto Sans CJK SC" w:hAnsi="Noto Sans CJK SC" w:eastAsia="Noto Sans CJK SC" w:cs="Noto Sans CJK SC"/>
-                <w:b w:val="0"/>
-                <w:color w:val="000000"/>
-                <w:sz w:val="19"/>
-              </w:rPr>
-              <w:t>黎志丽整理；田亦洁复核文件；莫远序最终检查</w:t>
-            </w:r>
-          </w:p>
-        </w:tc>
-      </w:tr>
-      <w:tr>
-        <w:trPr>
-          <w:cantSplit/>
-        </w:trPr>
-        <w:tc>
-          <w:tcPr>
-            <w:tcW w:type="dxa" w:w="2041"/>
-            <w:vAlign w:val="center"/>
-            <w:shd w:fill="FFFFFF"/>
-            <w:tcMar>
-              <w:top w:w="65" w:type="dxa"/>
-              <w:bottom w:w="65" w:type="dxa"/>
-              <w:left w:w="95" w:type="dxa"/>
-              <w:right w:w="95" w:type="dxa"/>
-            </w:tcMar>
-          </w:tcPr>
-          <w:p>
-            <w:pPr>
-              <w:spacing w:after="0" w:before="0" w:line="259" w:lineRule="auto"/>
-            </w:pPr>
-            <w:r>
-              <w:rPr>
-                <w:rFonts w:ascii="Noto Sans CJK SC" w:hAnsi="Noto Sans CJK SC" w:eastAsia="Noto Sans CJK SC" w:cs="Noto Sans CJK SC"/>
-                <w:b w:val="0"/>
-                <w:color w:val="000000"/>
-                <w:sz w:val="19"/>
-              </w:rPr>
-              <w:t>10/9–10/10</w:t>
-            </w:r>
-          </w:p>
-        </w:tc>
-        <w:tc>
-          <w:tcPr>
-            <w:tcW w:type="dxa" w:w="4309"/>
-            <w:vAlign w:val="center"/>
-            <w:shd w:fill="FFFFFF"/>
-            <w:tcMar>
-              <w:top w:w="65" w:type="dxa"/>
-              <w:bottom w:w="65" w:type="dxa"/>
-              <w:left w:w="95" w:type="dxa"/>
-              <w:right w:w="95" w:type="dxa"/>
-            </w:tcMar>
-          </w:tcPr>
-          <w:p>
-            <w:pPr>
-              <w:spacing w:after="0" w:before="0" w:line="259" w:lineRule="auto"/>
-            </w:pPr>
-            <w:r>
-              <w:rPr>
-                <w:rFonts w:ascii="Noto Sans CJK SC" w:hAnsi="Noto Sans CJK SC" w:eastAsia="Noto Sans CJK SC" w:cs="Noto Sans CJK SC"/>
-                <w:b w:val="0"/>
-                <w:color w:val="000000"/>
-                <w:sz w:val="19"/>
-              </w:rPr>
-              <w:t>修复遗漏和访问问题；整理真实过程 ZIP；按课程要求正式提交并留存回执</w:t>
-            </w:r>
-          </w:p>
-        </w:tc>
-        <w:tc>
-          <w:tcPr>
-            <w:tcW w:type="dxa" w:w="3061"/>
-            <w:vAlign w:val="center"/>
-            <w:shd w:fill="FFFFFF"/>
-            <w:tcMar>
-              <w:top w:w="65" w:type="dxa"/>
-              <w:bottom w:w="65" w:type="dxa"/>
-              <w:left w:w="95" w:type="dxa"/>
-              <w:right w:w="95" w:type="dxa"/>
-            </w:tcMar>
-          </w:tcPr>
-          <w:p>
-            <w:pPr>
-              <w:spacing w:after="0" w:before="0" w:line="259" w:lineRule="auto"/>
-            </w:pPr>
-            <w:r>
-              <w:rPr>
-                <w:rFonts w:ascii="Noto Sans CJK SC" w:hAnsi="Noto Sans CJK SC" w:eastAsia="Noto Sans CJK SC" w:cs="Noto Sans CJK SC"/>
-                <w:b w:val="0"/>
-                <w:color w:val="000000"/>
-                <w:sz w:val="19"/>
-              </w:rPr>
-              <w:t>莫远序提交；黎志丽复核</w:t>
-            </w:r>
-          </w:p>
-        </w:tc>
-      </w:tr>
-    </w:tbl>
-    <w:p>
-      <w:pPr>
-        <w:spacing w:after="20" w:before="0" w:line="40" w:lineRule="exact"/>
-      </w:pPr>
-      <w:r>
-        <w:rPr>
-          <w:sz w:val="4"/>
-        </w:rPr>
+        <w:t>7 过程留档说明</w:t>
       </w:r>
     </w:p>
     <w:p>
@@ -3325,7 +2203,7 @@
           <w:color w:val="000000"/>
           <w:sz w:val="20"/>
         </w:rPr>
-        <w:t>会议纪要记录实际时间、参会人员、主持和记录人、决定、行动项、责任人及期限。会议截图与纪要对应；任务快照注明导出时间，交付版本记录具体 commit 或 tag。模板、未来计划和真实过程材料分开保存，不补造会议、贡献或完成状态。</w:t>
+        <w:t>每周行动项、会议纪要、任务快照和版本证据持续记录于 process/，实时状态以 Notion 为准。会议纪要记录实际时间、参会人员、主持和记录人、决定、行动项、责任人及期限。会议截图与纪要对应；任务快照注明导出时间，交付版本记录具体 commit 或 tag。模板、未来计划和真实过程材料分开保存，不补造会议、贡献或完成状态。</w:t>
       </w:r>
     </w:p>
     <w:sectPr>

</xml_diff>